<commit_message>
feat: template v2 base Eduardo + defesas IOMAR e AMARILIO
</commit_message>
<xml_diff>
--- a/juridico/defesa-previa-165a/template_defesa_previa_165a.docx
+++ b/juridico/defesa-previa-165a/template_defesa_previa_165a.docx
@@ -43,18 +43,7 @@
           <w:sz w:val="22"/>
           <w:szCs w:val="22"/>
         </w:rPr>
-        <w:t xml:space="preserve"> – DETRAN/</w:t>
-      </w:r>
-      <w:r>
-        <w:rPr>
-          <w:rFonts w:ascii="Segoe UI" w:hAnsi="Segoe UI" w:cs="Segoe UI"/>
-          <w:b/>
-          <w:bCs/>
-          <w:color w:val="EE0000"/>
-          <w:sz w:val="22"/>
-          <w:szCs w:val="22"/>
-        </w:rPr>
-        <w:t>CE</w:t>
+        <w:t xml:space="preserve"> – {orgao_sigla}</w:t>
       </w:r>
     </w:p>
     <w:p>
@@ -191,7 +180,7 @@
           <w:szCs w:val="20"/>
           <w:lang w:eastAsia="en-US"/>
         </w:rPr>
-        <w:t>, brasileiro, solteiro, devidamente inscrito sob o CPF n°{cpf}, portador do documento de identidade/RG de n. {rg}, portador da {tipo_doc} de n° de registro: {numero_habilitacao}</w:t>
+        <w:t>, {nacionalidade}, {estado_civil}, {profissao}, devidamente inscrito sob o CPF n°{cpf}, portador do documento de identidade/RG de n. {rg}, portador da {tipo_doc} de n° de registro: {numero_habilitacao}</w:t>
       </w:r>
       <w:r>
         <w:rPr>
@@ -210,7 +199,7 @@
           <w:szCs w:val="20"/>
           <w:highlight w:val="lightGray"/>
         </w:rPr>
-        <w:t>Condutor do Veículo</w:t>
+        <w:t>{qualidade} do Veículo</w:t>
       </w:r>
       <w:r>
         <w:rPr>

</xml_diff>